<commit_message>
Flyttat redigerings-knappar till vänster
</commit_message>
<xml_diff>
--- a/files/Bilinmatmig_formulär.docx
+++ b/files/Bilinmatmig_formulär.docx
@@ -478,7 +478,492 @@
       <w:pPr>
         <w:pStyle w:val="Normal"/>
         <w:bidi w:val="0"/>
+        <w:spacing w:before="0" w:after="283"/>
         <w:jc w:val="left"/>
+        <w:rPr/>
+      </w:pPr>
+      <w:r>
+        <w:rPr/>
+      </w:r>
+    </w:p>
+    <w:p>
+      <w:pPr>
+        <w:pStyle w:val="BodyText"/>
+        <w:rPr/>
+      </w:pPr>
+      <w:hyperlink r:id="rId2">
+        <w:r>
+          <w:rPr>
+            <w:rStyle w:val="Hyperlink"/>
+          </w:rPr>
+          <w:t>https://www.pythonanywhere.com</w:t>
+        </w:r>
+      </w:hyperlink>
+    </w:p>
+    <w:p>
+      <w:pPr>
+        <w:pStyle w:val="BodyText"/>
+        <w:rPr/>
+      </w:pPr>
+      <w:r>
+        <w:rPr/>
+        <w:t>Databasen placering. Uppdatera varje månad.</w:t>
+      </w:r>
+    </w:p>
+    <w:p>
+      <w:pPr>
+        <w:pStyle w:val="BodyText"/>
+        <w:rPr/>
+      </w:pPr>
+      <w:r>
+        <w:rPr/>
+      </w:r>
+    </w:p>
+    <w:p>
+      <w:pPr>
+        <w:pStyle w:val="BodyText"/>
+        <w:rPr/>
+      </w:pPr>
+      <w:r>
+        <w:rPr/>
+        <w:t>Grattis! Nu är körjournalen live på internet!</w:t>
+      </w:r>
+    </w:p>
+    <w:p>
+      <w:pPr>
+        <w:pStyle w:val="BodyText"/>
+        <w:rPr/>
+      </w:pPr>
+      <w:r>
+        <w:rPr/>
+        <w:t>Du kan nu nå den från vilken enhet som helst:</w:t>
+      </w:r>
+    </w:p>
+    <w:p>
+      <w:pPr>
+        <w:pStyle w:val="BodyText"/>
+        <w:numPr>
+          <w:ilvl w:val="0"/>
+          <w:numId w:val="2"/>
+        </w:numPr>
+        <w:tabs>
+          <w:tab w:val="clear" w:pos="709"/>
+          <w:tab w:val="left" w:pos="0" w:leader="none"/>
+        </w:tabs>
+        <w:spacing w:before="0" w:after="0"/>
+        <w:ind w:hanging="283" w:left="709"/>
+        <w:rPr/>
+      </w:pPr>
+      <w:r>
+        <w:rPr>
+          <w:rStyle w:val="Strong"/>
+        </w:rPr>
+        <w:t>Körjournal:</w:t>
+      </w:r>
+      <w:r>
+        <w:rPr/>
+        <w:t xml:space="preserve"> </w:t>
+      </w:r>
+      <w:hyperlink r:id="rId3">
+        <w:r>
+          <w:rPr>
+            <w:rStyle w:val="Hyperlink"/>
+          </w:rPr>
+          <w:t>https://leifsture.pythonanywhere.com</w:t>
+        </w:r>
+      </w:hyperlink>
+      <w:r>
+        <w:rPr/>
+        <w:t xml:space="preserve"> </w:t>
+      </w:r>
+    </w:p>
+    <w:p>
+      <w:pPr>
+        <w:pStyle w:val="BodyText"/>
+        <w:numPr>
+          <w:ilvl w:val="0"/>
+          <w:numId w:val="2"/>
+        </w:numPr>
+        <w:tabs>
+          <w:tab w:val="clear" w:pos="709"/>
+          <w:tab w:val="left" w:pos="0" w:leader="none"/>
+        </w:tabs>
+        <w:spacing w:before="0" w:after="0"/>
+        <w:ind w:hanging="283" w:left="709"/>
+        <w:rPr/>
+      </w:pPr>
+      <w:r>
+        <w:rPr>
+          <w:rStyle w:val="Strong"/>
+        </w:rPr>
+        <w:t>Utgifter:</w:t>
+      </w:r>
+      <w:r>
+        <w:rPr/>
+        <w:t xml:space="preserve"> </w:t>
+      </w:r>
+      <w:hyperlink r:id="rId4">
+        <w:r>
+          <w:rPr>
+            <w:rStyle w:val="Hyperlink"/>
+          </w:rPr>
+          <w:t>https://leifsture.pythonanywhere.com/utgifter</w:t>
+        </w:r>
+      </w:hyperlink>
+      <w:r>
+        <w:rPr/>
+        <w:t xml:space="preserve"> </w:t>
+      </w:r>
+    </w:p>
+    <w:p>
+      <w:pPr>
+        <w:pStyle w:val="BodyText"/>
+        <w:numPr>
+          <w:ilvl w:val="0"/>
+          <w:numId w:val="2"/>
+        </w:numPr>
+        <w:tabs>
+          <w:tab w:val="clear" w:pos="709"/>
+          <w:tab w:val="left" w:pos="0" w:leader="none"/>
+        </w:tabs>
+        <w:ind w:hanging="283" w:left="709"/>
+        <w:rPr/>
+      </w:pPr>
+      <w:r>
+        <w:rPr>
+          <w:rStyle w:val="Strong"/>
+        </w:rPr>
+        <w:t>Summering:</w:t>
+      </w:r>
+      <w:r>
+        <w:rPr/>
+        <w:t xml:space="preserve"> </w:t>
+      </w:r>
+      <w:hyperlink r:id="rId5">
+        <w:r>
+          <w:rPr>
+            <w:rStyle w:val="Hyperlink"/>
+          </w:rPr>
+          <w:t>https://leifsture.pythonanywhere.com/summering</w:t>
+        </w:r>
+      </w:hyperlink>
+    </w:p>
+    <w:p>
+      <w:pPr>
+        <w:pStyle w:val="BodyText"/>
+        <w:rPr/>
+      </w:pPr>
+      <w:r>
+        <w:rPr/>
+      </w:r>
+    </w:p>
+    <w:p>
+      <w:pPr>
+        <w:pStyle w:val="BodyText"/>
+        <w:rPr/>
+      </w:pPr>
+      <w:r>
+        <w:rPr/>
+      </w:r>
+    </w:p>
+    <w:p>
+      <w:pPr>
+        <w:pStyle w:val="BodyText"/>
+        <w:rPr/>
+      </w:pPr>
+      <w:r>
+        <w:rPr/>
+        <w:t>Framöver när du gör ändringar lokalt är flödet:</w:t>
+      </w:r>
+    </w:p>
+    <w:p>
+      <w:pPr>
+        <w:pStyle w:val="BodyText"/>
+        <w:numPr>
+          <w:ilvl w:val="0"/>
+          <w:numId w:val="3"/>
+        </w:numPr>
+        <w:tabs>
+          <w:tab w:val="clear" w:pos="709"/>
+          <w:tab w:val="left" w:pos="0" w:leader="none"/>
+        </w:tabs>
+        <w:spacing w:before="0" w:after="0"/>
+        <w:ind w:hanging="283" w:left="709"/>
+        <w:rPr/>
+      </w:pPr>
+      <w:r>
+        <w:rPr/>
+        <w:t xml:space="preserve">Ändra filer i </w:t>
+      </w:r>
+      <w:r>
+        <w:rPr>
+          <w:rStyle w:val="Klltext"/>
+        </w:rPr>
+        <w:t>Car_report</w:t>
+      </w:r>
+      <w:r>
+        <w:rPr/>
+        <w:t xml:space="preserve"> på din dator </w:t>
+      </w:r>
+    </w:p>
+    <w:p>
+      <w:pPr>
+        <w:pStyle w:val="BodyText"/>
+        <w:numPr>
+          <w:ilvl w:val="0"/>
+          <w:numId w:val="3"/>
+        </w:numPr>
+        <w:tabs>
+          <w:tab w:val="clear" w:pos="709"/>
+          <w:tab w:val="left" w:pos="0" w:leader="none"/>
+        </w:tabs>
+        <w:spacing w:before="0" w:after="0"/>
+        <w:ind w:hanging="283" w:left="709"/>
+        <w:rPr/>
+      </w:pPr>
+      <w:r>
+        <w:rPr>
+          <w:rStyle w:val="Klltext"/>
+        </w:rPr>
+        <w:t>git add .</w:t>
+      </w:r>
+      <w:r>
+        <w:rPr/>
+        <w:t xml:space="preserve"> → </w:t>
+      </w:r>
+      <w:r>
+        <w:rPr>
+          <w:rStyle w:val="Klltext"/>
+        </w:rPr>
+        <w:t>git commit -m "..."</w:t>
+      </w:r>
+      <w:r>
+        <w:rPr/>
+        <w:t xml:space="preserve"> → </w:t>
+      </w:r>
+      <w:r>
+        <w:rPr>
+          <w:rStyle w:val="Klltext"/>
+        </w:rPr>
+        <w:t>git push</w:t>
+      </w:r>
+      <w:r>
+        <w:rPr/>
+        <w:t xml:space="preserve"> </w:t>
+      </w:r>
+    </w:p>
+    <w:p>
+      <w:pPr>
+        <w:pStyle w:val="BodyText"/>
+        <w:numPr>
+          <w:ilvl w:val="0"/>
+          <w:numId w:val="3"/>
+        </w:numPr>
+        <w:tabs>
+          <w:tab w:val="clear" w:pos="709"/>
+          <w:tab w:val="left" w:pos="0" w:leader="none"/>
+        </w:tabs>
+        <w:spacing w:before="0" w:after="0"/>
+        <w:ind w:hanging="283" w:left="709"/>
+        <w:rPr/>
+      </w:pPr>
+      <w:r>
+        <w:rPr/>
+        <w:t xml:space="preserve">På PythonAnywhere i Bash: </w:t>
+      </w:r>
+      <w:r>
+        <w:rPr>
+          <w:rStyle w:val="Klltext"/>
+        </w:rPr>
+        <w:t>cd ~/car-report &amp;&amp; git pull</w:t>
+      </w:r>
+      <w:r>
+        <w:rPr/>
+        <w:t xml:space="preserve"> </w:t>
+      </w:r>
+    </w:p>
+    <w:p>
+      <w:pPr>
+        <w:pStyle w:val="BodyText"/>
+        <w:numPr>
+          <w:ilvl w:val="0"/>
+          <w:numId w:val="3"/>
+        </w:numPr>
+        <w:tabs>
+          <w:tab w:val="clear" w:pos="709"/>
+          <w:tab w:val="left" w:pos="0" w:leader="none"/>
+        </w:tabs>
+        <w:ind w:hanging="283" w:left="709"/>
+        <w:rPr/>
+      </w:pPr>
+      <w:r>
+        <w:rPr/>
+        <w:t xml:space="preserve">Klicka </w:t>
+      </w:r>
+      <w:r>
+        <w:rPr>
+          <w:rStyle w:val="Strong"/>
+        </w:rPr>
+        <w:t>Reload</w:t>
+      </w:r>
+      <w:r>
+        <w:rPr/>
+        <w:t xml:space="preserve"> i Web-fliken</w:t>
+      </w:r>
+    </w:p>
+    <w:p>
+      <w:pPr>
+        <w:pStyle w:val="BodyText"/>
+        <w:rPr/>
+      </w:pPr>
+      <w:r>
+        <w:rPr/>
+      </w:r>
+    </w:p>
+    <w:p>
+      <w:pPr>
+        <w:pStyle w:val="BodyText"/>
+        <w:rPr/>
+      </w:pPr>
+      <w:r>
+        <w:rPr/>
+        <w:t>Fantastiskt! 🎉 Då är hela Car Report-appen live och fungerar på PythonAnywhere!</w:t>
+      </w:r>
+    </w:p>
+    <w:p>
+      <w:pPr>
+        <w:pStyle w:val="BodyText"/>
+        <w:rPr/>
+      </w:pPr>
+      <w:r>
+        <w:rPr/>
+        <w:t>Du har nu:</w:t>
+      </w:r>
+    </w:p>
+    <w:p>
+      <w:pPr>
+        <w:pStyle w:val="BodyText"/>
+        <w:numPr>
+          <w:ilvl w:val="0"/>
+          <w:numId w:val="4"/>
+        </w:numPr>
+        <w:tabs>
+          <w:tab w:val="clear" w:pos="709"/>
+          <w:tab w:val="left" w:pos="0" w:leader="none"/>
+        </w:tabs>
+        <w:spacing w:before="0" w:after="0"/>
+        <w:ind w:hanging="283" w:left="709"/>
+        <w:rPr/>
+      </w:pPr>
+      <w:r>
+        <w:rPr>
+          <w:rStyle w:val="Strong"/>
+        </w:rPr>
+        <w:t>Körjournal</w:t>
+      </w:r>
+      <w:r>
+        <w:rPr/>
+        <w:t xml:space="preserve"> med beräkningar, redigering, utskrift, CSV-export och backup </w:t>
+      </w:r>
+    </w:p>
+    <w:p>
+      <w:pPr>
+        <w:pStyle w:val="BodyText"/>
+        <w:numPr>
+          <w:ilvl w:val="0"/>
+          <w:numId w:val="4"/>
+        </w:numPr>
+        <w:tabs>
+          <w:tab w:val="clear" w:pos="709"/>
+          <w:tab w:val="left" w:pos="0" w:leader="none"/>
+        </w:tabs>
+        <w:spacing w:before="0" w:after="0"/>
+        <w:ind w:hanging="283" w:left="709"/>
+        <w:rPr/>
+      </w:pPr>
+      <w:r>
+        <w:rPr>
+          <w:rStyle w:val="Strong"/>
+        </w:rPr>
+        <w:t>Utgifter, BDO, Lorna</w:t>
+      </w:r>
+      <w:r>
+        <w:rPr/>
+        <w:t xml:space="preserve"> med separata inmatningar </w:t>
+      </w:r>
+    </w:p>
+    <w:p>
+      <w:pPr>
+        <w:pStyle w:val="BodyText"/>
+        <w:numPr>
+          <w:ilvl w:val="0"/>
+          <w:numId w:val="4"/>
+        </w:numPr>
+        <w:tabs>
+          <w:tab w:val="clear" w:pos="709"/>
+          <w:tab w:val="left" w:pos="0" w:leader="none"/>
+        </w:tabs>
+        <w:spacing w:before="0" w:after="0"/>
+        <w:ind w:hanging="283" w:left="709"/>
+        <w:rPr/>
+      </w:pPr>
+      <w:r>
+        <w:rPr>
+          <w:rStyle w:val="Strong"/>
+        </w:rPr>
+        <w:t>Summering</w:t>
+      </w:r>
+      <w:r>
+        <w:rPr/>
+        <w:t xml:space="preserve"> som automatiskt räknar ihop allt per år </w:t>
+      </w:r>
+    </w:p>
+    <w:p>
+      <w:pPr>
+        <w:pStyle w:val="BodyText"/>
+        <w:numPr>
+          <w:ilvl w:val="0"/>
+          <w:numId w:val="4"/>
+        </w:numPr>
+        <w:tabs>
+          <w:tab w:val="clear" w:pos="709"/>
+          <w:tab w:val="left" w:pos="0" w:leader="none"/>
+        </w:tabs>
+        <w:ind w:hanging="283" w:left="709"/>
+        <w:rPr/>
+      </w:pPr>
+      <w:r>
+        <w:rPr>
+          <w:rStyle w:val="Strong"/>
+        </w:rPr>
+        <w:t>Allt tillgängligt från vilken enhet som helst</w:t>
+      </w:r>
+      <w:r>
+        <w:rPr/>
+        <w:t xml:space="preserve"> via </w:t>
+      </w:r>
+      <w:hyperlink r:id="rId6">
+        <w:r>
+          <w:rPr>
+            <w:rStyle w:val="Hyperlink"/>
+          </w:rPr>
+          <w:t>https://leifsture.pythonanywhere.com</w:t>
+        </w:r>
+      </w:hyperlink>
+    </w:p>
+    <w:p>
+      <w:pPr>
+        <w:pStyle w:val="BodyText"/>
+        <w:rPr/>
+      </w:pPr>
+      <w:r>
+        <w:rPr/>
+      </w:r>
+    </w:p>
+    <w:p>
+      <w:pPr>
+        <w:pStyle w:val="BodyText"/>
+        <w:spacing w:before="0" w:after="140"/>
         <w:rPr/>
       </w:pPr>
       <w:r>
@@ -622,6 +1107,399 @@
   <w:abstractNum w:abstractNumId="2">
     <w:lvl w:ilvl="0">
       <w:start w:val="1"/>
+      <w:numFmt w:val="bullet"/>
+      <w:lvlText w:val=""/>
+      <w:lvlJc w:val="left"/>
+      <w:pPr>
+        <w:tabs>
+          <w:tab w:val="num" w:pos="709"/>
+        </w:tabs>
+        <w:ind w:left="709" w:hanging="283"/>
+      </w:pPr>
+      <w:rPr>
+        <w:rFonts w:ascii="Symbol" w:hAnsi="Symbol" w:cs="Symbol" w:hint="default"/>
+      </w:rPr>
+    </w:lvl>
+    <w:lvl w:ilvl="1">
+      <w:start w:val="1"/>
+      <w:numFmt w:val="bullet"/>
+      <w:lvlText w:val=""/>
+      <w:lvlJc w:val="left"/>
+      <w:pPr>
+        <w:tabs>
+          <w:tab w:val="num" w:pos="1418"/>
+        </w:tabs>
+        <w:ind w:left="1418" w:hanging="283"/>
+      </w:pPr>
+      <w:rPr>
+        <w:rFonts w:ascii="Symbol" w:hAnsi="Symbol" w:cs="Symbol" w:hint="default"/>
+      </w:rPr>
+    </w:lvl>
+    <w:lvl w:ilvl="2">
+      <w:start w:val="1"/>
+      <w:numFmt w:val="bullet"/>
+      <w:lvlText w:val=""/>
+      <w:lvlJc w:val="left"/>
+      <w:pPr>
+        <w:tabs>
+          <w:tab w:val="num" w:pos="2127"/>
+        </w:tabs>
+        <w:ind w:left="2127" w:hanging="283"/>
+      </w:pPr>
+      <w:rPr>
+        <w:rFonts w:ascii="Symbol" w:hAnsi="Symbol" w:cs="Symbol" w:hint="default"/>
+      </w:rPr>
+    </w:lvl>
+    <w:lvl w:ilvl="3">
+      <w:start w:val="1"/>
+      <w:numFmt w:val="bullet"/>
+      <w:lvlText w:val=""/>
+      <w:lvlJc w:val="left"/>
+      <w:pPr>
+        <w:tabs>
+          <w:tab w:val="num" w:pos="2836"/>
+        </w:tabs>
+        <w:ind w:left="2836" w:hanging="283"/>
+      </w:pPr>
+      <w:rPr>
+        <w:rFonts w:ascii="Symbol" w:hAnsi="Symbol" w:cs="Symbol" w:hint="default"/>
+      </w:rPr>
+    </w:lvl>
+    <w:lvl w:ilvl="4">
+      <w:start w:val="1"/>
+      <w:numFmt w:val="bullet"/>
+      <w:lvlText w:val=""/>
+      <w:lvlJc w:val="left"/>
+      <w:pPr>
+        <w:tabs>
+          <w:tab w:val="num" w:pos="3545"/>
+        </w:tabs>
+        <w:ind w:left="3545" w:hanging="283"/>
+      </w:pPr>
+      <w:rPr>
+        <w:rFonts w:ascii="Symbol" w:hAnsi="Symbol" w:cs="Symbol" w:hint="default"/>
+      </w:rPr>
+    </w:lvl>
+    <w:lvl w:ilvl="5">
+      <w:start w:val="1"/>
+      <w:numFmt w:val="bullet"/>
+      <w:lvlText w:val=""/>
+      <w:lvlJc w:val="left"/>
+      <w:pPr>
+        <w:tabs>
+          <w:tab w:val="num" w:pos="4254"/>
+        </w:tabs>
+        <w:ind w:left="4254" w:hanging="283"/>
+      </w:pPr>
+      <w:rPr>
+        <w:rFonts w:ascii="Symbol" w:hAnsi="Symbol" w:cs="Symbol" w:hint="default"/>
+      </w:rPr>
+    </w:lvl>
+    <w:lvl w:ilvl="6">
+      <w:start w:val="1"/>
+      <w:numFmt w:val="bullet"/>
+      <w:lvlText w:val=""/>
+      <w:lvlJc w:val="left"/>
+      <w:pPr>
+        <w:tabs>
+          <w:tab w:val="num" w:pos="4963"/>
+        </w:tabs>
+        <w:ind w:left="4963" w:hanging="283"/>
+      </w:pPr>
+      <w:rPr>
+        <w:rFonts w:ascii="Symbol" w:hAnsi="Symbol" w:cs="Symbol" w:hint="default"/>
+      </w:rPr>
+    </w:lvl>
+    <w:lvl w:ilvl="7">
+      <w:start w:val="1"/>
+      <w:numFmt w:val="bullet"/>
+      <w:lvlText w:val=""/>
+      <w:lvlJc w:val="left"/>
+      <w:pPr>
+        <w:tabs>
+          <w:tab w:val="num" w:pos="5672"/>
+        </w:tabs>
+        <w:ind w:left="5672" w:hanging="283"/>
+      </w:pPr>
+      <w:rPr>
+        <w:rFonts w:ascii="Symbol" w:hAnsi="Symbol" w:cs="Symbol" w:hint="default"/>
+      </w:rPr>
+    </w:lvl>
+    <w:lvl w:ilvl="8">
+      <w:start w:val="1"/>
+      <w:numFmt w:val="bullet"/>
+      <w:lvlText w:val=""/>
+      <w:lvlJc w:val="left"/>
+      <w:pPr>
+        <w:tabs>
+          <w:tab w:val="num" w:pos="6381"/>
+        </w:tabs>
+        <w:ind w:left="6381" w:hanging="283"/>
+      </w:pPr>
+      <w:rPr>
+        <w:rFonts w:ascii="Symbol" w:hAnsi="Symbol" w:cs="Symbol" w:hint="default"/>
+      </w:rPr>
+    </w:lvl>
+  </w:abstractNum>
+  <w:abstractNum w:abstractNumId="3">
+    <w:lvl w:ilvl="0">
+      <w:start w:val="1"/>
+      <w:numFmt w:val="decimal"/>
+      <w:lvlText w:val="%1."/>
+      <w:lvlJc w:val="left"/>
+      <w:pPr>
+        <w:tabs>
+          <w:tab w:val="num" w:pos="709"/>
+        </w:tabs>
+        <w:ind w:left="709" w:hanging="283"/>
+      </w:pPr>
+      <w:rPr/>
+    </w:lvl>
+    <w:lvl w:ilvl="1">
+      <w:start w:val="1"/>
+      <w:numFmt w:val="decimal"/>
+      <w:lvlText w:val="%2."/>
+      <w:lvlJc w:val="left"/>
+      <w:pPr>
+        <w:tabs>
+          <w:tab w:val="num" w:pos="1418"/>
+        </w:tabs>
+        <w:ind w:left="1418" w:hanging="283"/>
+      </w:pPr>
+      <w:rPr/>
+    </w:lvl>
+    <w:lvl w:ilvl="2">
+      <w:start w:val="1"/>
+      <w:numFmt w:val="decimal"/>
+      <w:lvlText w:val="%3."/>
+      <w:lvlJc w:val="left"/>
+      <w:pPr>
+        <w:tabs>
+          <w:tab w:val="num" w:pos="2127"/>
+        </w:tabs>
+        <w:ind w:left="2127" w:hanging="283"/>
+      </w:pPr>
+      <w:rPr/>
+    </w:lvl>
+    <w:lvl w:ilvl="3">
+      <w:start w:val="1"/>
+      <w:numFmt w:val="decimal"/>
+      <w:lvlText w:val="%4."/>
+      <w:lvlJc w:val="left"/>
+      <w:pPr>
+        <w:tabs>
+          <w:tab w:val="num" w:pos="2836"/>
+        </w:tabs>
+        <w:ind w:left="2836" w:hanging="283"/>
+      </w:pPr>
+      <w:rPr/>
+    </w:lvl>
+    <w:lvl w:ilvl="4">
+      <w:start w:val="1"/>
+      <w:numFmt w:val="decimal"/>
+      <w:lvlText w:val="%5."/>
+      <w:lvlJc w:val="left"/>
+      <w:pPr>
+        <w:tabs>
+          <w:tab w:val="num" w:pos="3545"/>
+        </w:tabs>
+        <w:ind w:left="3545" w:hanging="283"/>
+      </w:pPr>
+      <w:rPr/>
+    </w:lvl>
+    <w:lvl w:ilvl="5">
+      <w:start w:val="1"/>
+      <w:numFmt w:val="decimal"/>
+      <w:lvlText w:val="%6."/>
+      <w:lvlJc w:val="left"/>
+      <w:pPr>
+        <w:tabs>
+          <w:tab w:val="num" w:pos="4254"/>
+        </w:tabs>
+        <w:ind w:left="4254" w:hanging="283"/>
+      </w:pPr>
+      <w:rPr/>
+    </w:lvl>
+    <w:lvl w:ilvl="6">
+      <w:start w:val="1"/>
+      <w:numFmt w:val="decimal"/>
+      <w:lvlText w:val="%7."/>
+      <w:lvlJc w:val="left"/>
+      <w:pPr>
+        <w:tabs>
+          <w:tab w:val="num" w:pos="4963"/>
+        </w:tabs>
+        <w:ind w:left="4963" w:hanging="283"/>
+      </w:pPr>
+      <w:rPr/>
+    </w:lvl>
+    <w:lvl w:ilvl="7">
+      <w:start w:val="1"/>
+      <w:numFmt w:val="decimal"/>
+      <w:lvlText w:val="%8."/>
+      <w:lvlJc w:val="left"/>
+      <w:pPr>
+        <w:tabs>
+          <w:tab w:val="num" w:pos="5672"/>
+        </w:tabs>
+        <w:ind w:left="5672" w:hanging="283"/>
+      </w:pPr>
+      <w:rPr/>
+    </w:lvl>
+    <w:lvl w:ilvl="8">
+      <w:start w:val="1"/>
+      <w:numFmt w:val="decimal"/>
+      <w:lvlText w:val="%9."/>
+      <w:lvlJc w:val="left"/>
+      <w:pPr>
+        <w:tabs>
+          <w:tab w:val="num" w:pos="6381"/>
+        </w:tabs>
+        <w:ind w:left="6381" w:hanging="283"/>
+      </w:pPr>
+      <w:rPr/>
+    </w:lvl>
+  </w:abstractNum>
+  <w:abstractNum w:abstractNumId="4">
+    <w:lvl w:ilvl="0">
+      <w:start w:val="1"/>
+      <w:numFmt w:val="bullet"/>
+      <w:lvlText w:val=""/>
+      <w:lvlJc w:val="left"/>
+      <w:pPr>
+        <w:tabs>
+          <w:tab w:val="num" w:pos="709"/>
+        </w:tabs>
+        <w:ind w:left="709" w:hanging="283"/>
+      </w:pPr>
+      <w:rPr>
+        <w:rFonts w:ascii="Symbol" w:hAnsi="Symbol" w:cs="Symbol" w:hint="default"/>
+      </w:rPr>
+    </w:lvl>
+    <w:lvl w:ilvl="1">
+      <w:start w:val="1"/>
+      <w:numFmt w:val="bullet"/>
+      <w:lvlText w:val=""/>
+      <w:lvlJc w:val="left"/>
+      <w:pPr>
+        <w:tabs>
+          <w:tab w:val="num" w:pos="1418"/>
+        </w:tabs>
+        <w:ind w:left="1418" w:hanging="283"/>
+      </w:pPr>
+      <w:rPr>
+        <w:rFonts w:ascii="Symbol" w:hAnsi="Symbol" w:cs="Symbol" w:hint="default"/>
+      </w:rPr>
+    </w:lvl>
+    <w:lvl w:ilvl="2">
+      <w:start w:val="1"/>
+      <w:numFmt w:val="bullet"/>
+      <w:lvlText w:val=""/>
+      <w:lvlJc w:val="left"/>
+      <w:pPr>
+        <w:tabs>
+          <w:tab w:val="num" w:pos="2127"/>
+        </w:tabs>
+        <w:ind w:left="2127" w:hanging="283"/>
+      </w:pPr>
+      <w:rPr>
+        <w:rFonts w:ascii="Symbol" w:hAnsi="Symbol" w:cs="Symbol" w:hint="default"/>
+      </w:rPr>
+    </w:lvl>
+    <w:lvl w:ilvl="3">
+      <w:start w:val="1"/>
+      <w:numFmt w:val="bullet"/>
+      <w:lvlText w:val=""/>
+      <w:lvlJc w:val="left"/>
+      <w:pPr>
+        <w:tabs>
+          <w:tab w:val="num" w:pos="2836"/>
+        </w:tabs>
+        <w:ind w:left="2836" w:hanging="283"/>
+      </w:pPr>
+      <w:rPr>
+        <w:rFonts w:ascii="Symbol" w:hAnsi="Symbol" w:cs="Symbol" w:hint="default"/>
+      </w:rPr>
+    </w:lvl>
+    <w:lvl w:ilvl="4">
+      <w:start w:val="1"/>
+      <w:numFmt w:val="bullet"/>
+      <w:lvlText w:val=""/>
+      <w:lvlJc w:val="left"/>
+      <w:pPr>
+        <w:tabs>
+          <w:tab w:val="num" w:pos="3545"/>
+        </w:tabs>
+        <w:ind w:left="3545" w:hanging="283"/>
+      </w:pPr>
+      <w:rPr>
+        <w:rFonts w:ascii="Symbol" w:hAnsi="Symbol" w:cs="Symbol" w:hint="default"/>
+      </w:rPr>
+    </w:lvl>
+    <w:lvl w:ilvl="5">
+      <w:start w:val="1"/>
+      <w:numFmt w:val="bullet"/>
+      <w:lvlText w:val=""/>
+      <w:lvlJc w:val="left"/>
+      <w:pPr>
+        <w:tabs>
+          <w:tab w:val="num" w:pos="4254"/>
+        </w:tabs>
+        <w:ind w:left="4254" w:hanging="283"/>
+      </w:pPr>
+      <w:rPr>
+        <w:rFonts w:ascii="Symbol" w:hAnsi="Symbol" w:cs="Symbol" w:hint="default"/>
+      </w:rPr>
+    </w:lvl>
+    <w:lvl w:ilvl="6">
+      <w:start w:val="1"/>
+      <w:numFmt w:val="bullet"/>
+      <w:lvlText w:val=""/>
+      <w:lvlJc w:val="left"/>
+      <w:pPr>
+        <w:tabs>
+          <w:tab w:val="num" w:pos="4963"/>
+        </w:tabs>
+        <w:ind w:left="4963" w:hanging="283"/>
+      </w:pPr>
+      <w:rPr>
+        <w:rFonts w:ascii="Symbol" w:hAnsi="Symbol" w:cs="Symbol" w:hint="default"/>
+      </w:rPr>
+    </w:lvl>
+    <w:lvl w:ilvl="7">
+      <w:start w:val="1"/>
+      <w:numFmt w:val="bullet"/>
+      <w:lvlText w:val=""/>
+      <w:lvlJc w:val="left"/>
+      <w:pPr>
+        <w:tabs>
+          <w:tab w:val="num" w:pos="5672"/>
+        </w:tabs>
+        <w:ind w:left="5672" w:hanging="283"/>
+      </w:pPr>
+      <w:rPr>
+        <w:rFonts w:ascii="Symbol" w:hAnsi="Symbol" w:cs="Symbol" w:hint="default"/>
+      </w:rPr>
+    </w:lvl>
+    <w:lvl w:ilvl="8">
+      <w:start w:val="1"/>
+      <w:numFmt w:val="bullet"/>
+      <w:lvlText w:val=""/>
+      <w:lvlJc w:val="left"/>
+      <w:pPr>
+        <w:tabs>
+          <w:tab w:val="num" w:pos="6381"/>
+        </w:tabs>
+        <w:ind w:left="6381" w:hanging="283"/>
+      </w:pPr>
+      <w:rPr>
+        <w:rFonts w:ascii="Symbol" w:hAnsi="Symbol" w:cs="Symbol" w:hint="default"/>
+      </w:rPr>
+    </w:lvl>
+  </w:abstractNum>
+  <w:abstractNum w:abstractNumId="5">
+    <w:lvl w:ilvl="0">
+      <w:start w:val="1"/>
       <w:numFmt w:val="none"/>
       <w:suff w:val="nothing"/>
       <w:lvlText w:val=""/>
@@ -744,6 +1622,15 @@
   </w:num>
   <w:num w:numId="2">
     <w:abstractNumId w:val="2"/>
+  </w:num>
+  <w:num w:numId="3">
+    <w:abstractNumId w:val="3"/>
+  </w:num>
+  <w:num w:numId="4">
+    <w:abstractNumId w:val="4"/>
+  </w:num>
+  <w:num w:numId="5">
+    <w:abstractNumId w:val="5"/>
   </w:num>
 </w:numbering>
 </file>
@@ -821,6 +1708,20 @@
     <w:name w:val="Numreringstecken"/>
     <w:qFormat/>
     <w:rPr/>
+  </w:style>
+  <w:style w:type="character" w:styleId="Hyperlink">
+    <w:name w:val="Hyperlink"/>
+    <w:rPr>
+      <w:color w:val="000080"/>
+      <w:u w:val="single"/>
+    </w:rPr>
+  </w:style>
+  <w:style w:type="character" w:styleId="Punkter">
+    <w:name w:val="Punkter"/>
+    <w:qFormat/>
+    <w:rPr>
+      <w:rFonts w:ascii="OpenSymbol" w:hAnsi="OpenSymbol" w:eastAsia="OpenSymbol" w:cs="OpenSymbol"/>
+    </w:rPr>
   </w:style>
   <w:style w:type="paragraph" w:styleId="Rubrik">
     <w:name w:val="Rubrik"/>

</xml_diff>